<commit_message>
Reclassify memory component application
</commit_message>
<xml_diff>
--- a/applications/2026/Q2/BGA200内存返修工具/申报书.docx
+++ b/applications/2026/Q2/BGA200内存返修工具/申报书.docx
@@ -4,12 +4,12 @@
   <w:body>
     <w:p>
       <w:pPr>
-        <w:pStyle w:val="Title"/>
         <w:jc w:val="center"/>
       </w:pPr>
       <w:r>
         <w:rPr>
           <w:rFonts w:ascii="Times New Roman" w:hAnsi="Times New Roman" w:eastAsia="黑体"/>
+          <w:b/>
           <w:sz w:val="36"/>
         </w:rPr>
         <w:t>BGA200内存颗粒返修工具采购</w:t>
@@ -33,7 +33,7 @@
           <w:rFonts w:ascii="Times New Roman" w:hAnsi="Times New Roman" w:eastAsia="宋体"/>
           <w:b w:val="0"/>
         </w:rPr>
-        <w:t>本次拟申报采购：BGA200 内存颗粒植锡与返修学习工具采购。本项目拟采购 BGA200 内存颗粒返修学习工具，包括 BGA200 4 合 1 植锡台和一颗 4G LPDDR4X 颗粒。当前内存颗粒在开发板和 FPGA 板卡维修、升级场景中存在明显溢价，若完全依赖整板替换，成本高且学习价值低。通过购置植锡工具和实验颗粒，可建立从拆颗粒、清焊盘、定位、上锡、回流到焊后检查的完整训练流程，为后续 FPGA、Linux 开发板、边缘计算板等平台的内存返修和颗粒替换提供基础能力。</w:t>
+        <w:t>本次拟申报采购 BGA200 4 合 1 植锡台，作为实验室长期复用的内存颗粒返修工具。当前内存颗粒在开发板和 FPGA 板卡维修、升级场景中存在明显溢价，若完全依赖整板替换，成本高且学习价值低。工具与耗材分开申报后，BGA200 植锡台作为返修工具归档，LPDDR4X 颗粒作为电子元器件耗材归入“实验室电子元器件采集”申报。</w:t>
       </w:r>
     </w:p>
     <w:p>
@@ -210,73 +210,6 @@
               <w:rPr>
                 <w:rFonts w:ascii="Times New Roman" w:hAnsi="Times New Roman" w:eastAsia="宋体"/>
               </w:rPr>
-              <w:t>MT53D1024M32D4DT-053WT:D 4G LPDDR4X 颗粒</w:t>
-            </w:r>
-          </w:p>
-        </w:tc>
-        <w:tc>
-          <w:tcPr>
-            <w:tcW w:type="dxa" w:w="1728"/>
-          </w:tcPr>
-          <w:p>
-            <w:r>
-              <w:rPr>
-                <w:rFonts w:ascii="Times New Roman" w:hAnsi="Times New Roman" w:eastAsia="宋体"/>
-              </w:rPr>
-              <w:t>1</w:t>
-            </w:r>
-          </w:p>
-        </w:tc>
-        <w:tc>
-          <w:tcPr>
-            <w:tcW w:type="dxa" w:w="1728"/>
-          </w:tcPr>
-          <w:p>
-            <w:r>
-              <w:rPr>
-                <w:rFonts w:ascii="Times New Roman" w:hAnsi="Times New Roman" w:eastAsia="宋体"/>
-              </w:rPr>
-              <w:t>55.00</w:t>
-            </w:r>
-          </w:p>
-        </w:tc>
-        <w:tc>
-          <w:tcPr>
-            <w:tcW w:type="dxa" w:w="1728"/>
-          </w:tcPr>
-          <w:p>
-            <w:r>
-              <w:rPr>
-                <w:rFonts w:ascii="Times New Roman" w:hAnsi="Times New Roman" w:eastAsia="宋体"/>
-              </w:rPr>
-              <w:t>55.00</w:t>
-            </w:r>
-          </w:p>
-        </w:tc>
-        <w:tc>
-          <w:tcPr>
-            <w:tcW w:type="dxa" w:w="1728"/>
-          </w:tcPr>
-          <w:p>
-            <w:r>
-              <w:rPr>
-                <w:rFonts w:ascii="Times New Roman" w:hAnsi="Times New Roman" w:eastAsia="宋体"/>
-              </w:rPr>
-              <w:t>用于植锡和更换颗粒流程验证</w:t>
-            </w:r>
-          </w:p>
-        </w:tc>
-      </w:tr>
-      <w:tr>
-        <w:tc>
-          <w:tcPr>
-            <w:tcW w:type="dxa" w:w="1728"/>
-          </w:tcPr>
-          <w:p>
-            <w:r>
-              <w:rPr>
-                <w:rFonts w:ascii="Times New Roman" w:hAnsi="Times New Roman" w:eastAsia="宋体"/>
-              </w:rPr>
               <w:t>合计</w:t>
             </w:r>
           </w:p>
@@ -314,7 +247,7 @@
               <w:rPr>
                 <w:rFonts w:ascii="Times New Roman" w:hAnsi="Times New Roman" w:eastAsia="宋体"/>
               </w:rPr>
-              <w:t>222.00</w:t>
+              <w:t>167.00</w:t>
             </w:r>
           </w:p>
         </w:tc>
@@ -386,7 +319,7 @@
         <w:rPr>
           <w:rFonts w:ascii="Times New Roman" w:hAnsi="Times New Roman" w:eastAsia="宋体"/>
         </w:rPr>
-        <w:t>采购一颗 4G LPDDR4X 作为练习和验证颗粒，有利于建立真实封装、真实焊盘尺度下的操作经验。</w:t>
+        <w:t>工具与耗材分开申报后，BGA200 植锡台作为长期复用工具归档，LPDDR4X 颗粒作为电子元器件耗材归档。</w:t>
       </w:r>
     </w:p>
     <w:p>
@@ -420,7 +353,7 @@
         <w:rPr>
           <w:rFonts w:ascii="Times New Roman" w:hAnsi="Times New Roman" w:eastAsia="宋体"/>
         </w:rPr>
-        <w:t>完成工具和内存颗粒到货验收，记录钢网、定位板、磁铁底座和刮刀完整性。</w:t>
+        <w:t>完成工具到货验收，记录钢网、定位板、磁铁底座和刮刀完整性。</w:t>
       </w:r>
     </w:p>
     <w:p>
@@ -487,7 +420,7 @@
         <w:rPr>
           <w:rFonts w:ascii="Times New Roman" w:hAnsi="Times New Roman" w:eastAsia="宋体"/>
         </w:rPr>
-        <w:t>BGA200 植锡台和 LPDDR4X 颗粒数量、规格、外观验收完成。</w:t>
+        <w:t>BGA200 植锡台数量、规格、外观验收完成。</w:t>
       </w:r>
     </w:p>
     <w:p>
@@ -565,54 +498,6 @@
                   </pic:nvPicPr>
                   <pic:blipFill>
                     <a:blip r:embed="rId9"/>
-                    <a:stretch>
-                      <a:fillRect/>
-                    </a:stretch>
-                  </pic:blipFill>
-                  <pic:spPr>
-                    <a:xfrm>
-                      <a:off x="0" y="0"/>
-                      <a:ext cx="5303520" cy="2883789"/>
-                    </a:xfrm>
-                    <a:prstGeom prst="rect"/>
-                  </pic:spPr>
-                </pic:pic>
-              </a:graphicData>
-            </a:graphic>
-          </wp:inline>
-        </w:drawing>
-      </w:r>
-    </w:p>
-    <w:p>
-      <w:pPr>
-        <w:pStyle w:val="Heading2"/>
-      </w:pPr>
-      <w:r>
-        <w:rPr>
-          <w:rFonts w:ascii="Times New Roman" w:hAnsi="Times New Roman" w:eastAsia="宋体"/>
-          <w:b w:val="0"/>
-        </w:rPr>
-        <w:t>LPDDR4X 内存颗粒价格截图</w:t>
-      </w:r>
-    </w:p>
-    <w:p>
-      <w:r>
-        <w:drawing>
-          <wp:inline xmlns:a="http://schemas.openxmlformats.org/drawingml/2006/main" xmlns:pic="http://schemas.openxmlformats.org/drawingml/2006/picture">
-            <wp:extent cx="5303520" cy="2883789"/>
-            <wp:docPr id="2" name="Picture 2"/>
-            <wp:cNvGraphicFramePr>
-              <a:graphicFrameLocks noChangeAspect="1"/>
-            </wp:cNvGraphicFramePr>
-            <a:graphic>
-              <a:graphicData uri="http://schemas.openxmlformats.org/drawingml/2006/picture">
-                <pic:pic>
-                  <pic:nvPicPr>
-                    <pic:cNvPr id="0" name="taobao-lpddr4x-4g.png"/>
-                    <pic:cNvPicPr/>
-                  </pic:nvPicPr>
-                  <pic:blipFill>
-                    <a:blip r:embed="rId10"/>
                     <a:stretch>
                       <a:fillRect/>
                     </a:stretch>
@@ -1378,7 +1263,7 @@
       <w:contextualSpacing/>
     </w:pPr>
     <w:rPr>
-      <w:rFonts w:asciiTheme="majorHAnsi" w:eastAsiaTheme="majorEastAsia" w:hAnsiTheme="majorHAnsi" w:cstheme="majorBidi" w:ascii="Times New Roman" w:hAnsi="Times New Roman" w:eastAsia="黑体"/>
+      <w:rFonts w:asciiTheme="majorHAnsi" w:eastAsiaTheme="majorEastAsia" w:hAnsiTheme="majorHAnsi" w:cstheme="majorBidi"/>
       <w:color w:val="17365D" w:themeColor="text2" w:themeShade="BF"/>
       <w:spacing w:val="5"/>
       <w:kern w:val="28"/>

</xml_diff>

<commit_message>
Enforce proposal document template outline
</commit_message>
<xml_diff>
--- a/applications/2026/Q2/BGA200内存返修工具/申报书.docx
+++ b/applications/2026/Q2/BGA200内存返修工具/申报书.docx
@@ -21,10 +21,10 @@
       </w:pPr>
       <w:r>
         <w:rPr>
-          <w:rFonts w:ascii="Times New Roman" w:hAnsi="Times New Roman" w:eastAsia="宋体"/>
-          <w:b w:val="0"/>
+          <w:rFonts w:ascii="Times New Roman" w:hAnsi="Times New Roman" w:eastAsia="黑体"/>
+          <w:sz w:val="28"/>
         </w:rPr>
-        <w:t>一、申报摘要</w:t>
+        <w:t>一、需求分析</w:t>
       </w:r>
     </w:p>
     <w:p>
@@ -33,7 +33,7 @@
           <w:rFonts w:ascii="Times New Roman" w:hAnsi="Times New Roman" w:eastAsia="宋体"/>
           <w:b w:val="0"/>
         </w:rPr>
-        <w:t>本次拟申报采购 BGA200 4 合 1 植锡台，作为实验室长期复用的内存颗粒返修工具。当前内存颗粒在开发板和 FPGA 板卡维修、升级场景中存在明显溢价，若完全依赖整板替换，成本高且学习价值低。工具与耗材分开申报后，BGA200 植锡台作为返修工具归档，LPDDR4X 颗粒作为电子元器件耗材归入“实验室电子元器件采集”申报。</w:t>
+        <w:t>开发板、FPGA 板卡和边缘计算板常使用 BGA/LPDDR 类内存颗粒，维修和升级时如果完全依赖整板替换，成本高且不利于掌握底层硬件工艺。实验室需要低成本、可长期复用的 BGA200 植锡工具，用于建立内存颗粒拆焊、植锡和回流的基本训练流程。</w:t>
       </w:r>
     </w:p>
     <w:p>
@@ -42,10 +42,76 @@
       </w:pPr>
       <w:r>
         <w:rPr>
+          <w:rFonts w:ascii="Times New Roman" w:hAnsi="Times New Roman" w:eastAsia="黑体"/>
+          <w:sz w:val="28"/>
+        </w:rPr>
+        <w:t>二、目的用途</w:t>
+      </w:r>
+    </w:p>
+    <w:p>
+      <w:r>
+        <w:rPr>
           <w:rFonts w:ascii="Times New Roman" w:hAnsi="Times New Roman" w:eastAsia="宋体"/>
           <w:b w:val="0"/>
         </w:rPr>
-        <w:t>二、采购对象与价格</w:t>
+        <w:t>采购 BGA200 4 合 1 植锡台，用于 BGA200 内存颗粒返修学习和工艺验证。工具用于钢网定位、上锡和重复练习，配套练习颗粒已归入实验室电子元器件申报，工具与耗材分开归档。</w:t>
+      </w:r>
+    </w:p>
+    <w:p>
+      <w:pPr>
+        <w:pStyle w:val="Heading1"/>
+      </w:pPr>
+      <w:r>
+        <w:rPr>
+          <w:rFonts w:ascii="Times New Roman" w:hAnsi="Times New Roman" w:eastAsia="黑体"/>
+          <w:sz w:val="28"/>
+        </w:rPr>
+        <w:t>三、实现目标</w:t>
+      </w:r>
+    </w:p>
+    <w:p>
+      <w:pPr>
+        <w:pStyle w:val="ListBullet"/>
+      </w:pPr>
+      <w:r>
+        <w:rPr>
+          <w:rFonts w:ascii="Times New Roman" w:hAnsi="Times New Roman" w:eastAsia="宋体"/>
+        </w:rPr>
+        <w:t>完成 BGA200 植锡台到货验收，确认钢网、定位板、磁铁底座和刮刀完整。</w:t>
+      </w:r>
+    </w:p>
+    <w:p>
+      <w:pPr>
+        <w:pStyle w:val="ListBullet"/>
+      </w:pPr>
+      <w:r>
+        <w:rPr>
+          <w:rFonts w:ascii="Times New Roman" w:hAnsi="Times New Roman" w:eastAsia="宋体"/>
+        </w:rPr>
+        <w:t>完成至少一次 BGA200 植锡练习，记录焊膏量、对位误差、回流效果和失败现象。</w:t>
+      </w:r>
+    </w:p>
+    <w:p>
+      <w:pPr>
+        <w:pStyle w:val="ListBullet"/>
+      </w:pPr>
+      <w:r>
+        <w:rPr>
+          <w:rFonts w:ascii="Times New Roman" w:hAnsi="Times New Roman" w:eastAsia="宋体"/>
+        </w:rPr>
+        <w:t>形成一份返修流程记录，用于后续 FPGA、Linux 开发板等内存颗粒返修学习。</w:t>
+      </w:r>
+    </w:p>
+    <w:p>
+      <w:pPr>
+        <w:pStyle w:val="Heading1"/>
+      </w:pPr>
+      <w:r>
+        <w:rPr>
+          <w:rFonts w:ascii="Times New Roman" w:hAnsi="Times New Roman" w:eastAsia="黑体"/>
+          <w:sz w:val="28"/>
+        </w:rPr>
+        <w:t>经费数量</w:t>
       </w:r>
     </w:p>
     <w:tbl>
@@ -69,8 +135,9 @@
           <w:p>
             <w:r>
               <w:rPr>
-                <w:rFonts w:ascii="Times New Roman" w:hAnsi="Times New Roman" w:eastAsia="宋体"/>
+                <w:rFonts w:ascii="Times New Roman" w:hAnsi="Times New Roman" w:eastAsia="黑体"/>
                 <w:b/>
+                <w:sz w:val="16"/>
               </w:rPr>
               <w:t>项目</w:t>
             </w:r>
@@ -83,8 +150,9 @@
           <w:p>
             <w:r>
               <w:rPr>
-                <w:rFonts w:ascii="Times New Roman" w:hAnsi="Times New Roman" w:eastAsia="宋体"/>
+                <w:rFonts w:ascii="Times New Roman" w:hAnsi="Times New Roman" w:eastAsia="黑体"/>
                 <w:b/>
+                <w:sz w:val="16"/>
               </w:rPr>
               <w:t>数量</w:t>
             </w:r>
@@ -97,8 +165,9 @@
           <w:p>
             <w:r>
               <w:rPr>
-                <w:rFonts w:ascii="Times New Roman" w:hAnsi="Times New Roman" w:eastAsia="宋体"/>
+                <w:rFonts w:ascii="Times New Roman" w:hAnsi="Times New Roman" w:eastAsia="黑体"/>
                 <w:b/>
+                <w:sz w:val="16"/>
               </w:rPr>
               <w:t>单价(CNY)</w:t>
             </w:r>
@@ -111,8 +180,9 @@
           <w:p>
             <w:r>
               <w:rPr>
-                <w:rFonts w:ascii="Times New Roman" w:hAnsi="Times New Roman" w:eastAsia="宋体"/>
+                <w:rFonts w:ascii="Times New Roman" w:hAnsi="Times New Roman" w:eastAsia="黑体"/>
                 <w:b/>
+                <w:sz w:val="16"/>
               </w:rPr>
               <w:t>小计(CNY)</w:t>
             </w:r>
@@ -125,8 +195,9 @@
           <w:p>
             <w:r>
               <w:rPr>
-                <w:rFonts w:ascii="Times New Roman" w:hAnsi="Times New Roman" w:eastAsia="宋体"/>
+                <w:rFonts w:ascii="Times New Roman" w:hAnsi="Times New Roman" w:eastAsia="黑体"/>
                 <w:b/>
+                <w:sz w:val="16"/>
               </w:rPr>
               <w:t>备注</w:t>
             </w:r>
@@ -142,6 +213,7 @@
             <w:r>
               <w:rPr>
                 <w:rFonts w:ascii="Times New Roman" w:hAnsi="Times New Roman" w:eastAsia="宋体"/>
+                <w:sz w:val="16"/>
               </w:rPr>
               <w:t>BGA200 4合1植锡台</w:t>
             </w:r>
@@ -152,9 +224,13 @@
             <w:tcW w:type="dxa" w:w="1728"/>
           </w:tcPr>
           <w:p>
+            <w:pPr>
+              <w:jc w:val="center"/>
+            </w:pPr>
             <w:r>
               <w:rPr>
                 <w:rFonts w:ascii="Times New Roman" w:hAnsi="Times New Roman" w:eastAsia="宋体"/>
+                <w:sz w:val="16"/>
               </w:rPr>
               <w:t>1</w:t>
             </w:r>
@@ -165,9 +241,30 @@
             <w:tcW w:type="dxa" w:w="1728"/>
           </w:tcPr>
           <w:p>
+            <w:pPr>
+              <w:jc w:val="center"/>
+            </w:pPr>
             <w:r>
               <w:rPr>
                 <w:rFonts w:ascii="Times New Roman" w:hAnsi="Times New Roman" w:eastAsia="宋体"/>
+                <w:sz w:val="16"/>
+              </w:rPr>
+              <w:t>167.00</w:t>
+            </w:r>
+          </w:p>
+        </w:tc>
+        <w:tc>
+          <w:tcPr>
+            <w:tcW w:type="dxa" w:w="1728"/>
+          </w:tcPr>
+          <w:p>
+            <w:pPr>
+              <w:jc w:val="center"/>
+            </w:pPr>
+            <w:r>
+              <w:rPr>
+                <w:rFonts w:ascii="Times New Roman" w:hAnsi="Times New Roman" w:eastAsia="宋体"/>
+                <w:sz w:val="16"/>
               </w:rPr>
               <w:t>167.00</w:t>
             </w:r>
@@ -181,6 +278,72 @@
             <w:r>
               <w:rPr>
                 <w:rFonts w:ascii="Times New Roman" w:hAnsi="Times New Roman" w:eastAsia="宋体"/>
+                <w:sz w:val="16"/>
+              </w:rPr>
+              <w:t>淘宝桌面版截图识别价格</w:t>
+            </w:r>
+          </w:p>
+        </w:tc>
+      </w:tr>
+      <w:tr>
+        <w:tc>
+          <w:tcPr>
+            <w:tcW w:type="dxa" w:w="1728"/>
+          </w:tcPr>
+          <w:p>
+            <w:r>
+              <w:rPr>
+                <w:rFonts w:ascii="Times New Roman" w:hAnsi="Times New Roman" w:eastAsia="宋体"/>
+                <w:sz w:val="16"/>
+              </w:rPr>
+              <w:t>合计</w:t>
+            </w:r>
+          </w:p>
+        </w:tc>
+        <w:tc>
+          <w:tcPr>
+            <w:tcW w:type="dxa" w:w="1728"/>
+          </w:tcPr>
+          <w:p>
+            <w:pPr>
+              <w:jc w:val="center"/>
+            </w:pPr>
+            <w:r>
+              <w:rPr>
+                <w:rFonts w:ascii="Times New Roman" w:hAnsi="Times New Roman" w:eastAsia="宋体"/>
+                <w:sz w:val="16"/>
+              </w:rPr>
+            </w:r>
+          </w:p>
+        </w:tc>
+        <w:tc>
+          <w:tcPr>
+            <w:tcW w:type="dxa" w:w="1728"/>
+          </w:tcPr>
+          <w:p>
+            <w:pPr>
+              <w:jc w:val="center"/>
+            </w:pPr>
+            <w:r>
+              <w:rPr>
+                <w:rFonts w:ascii="Times New Roman" w:hAnsi="Times New Roman" w:eastAsia="宋体"/>
+                <w:sz w:val="16"/>
+              </w:rPr>
+            </w:r>
+          </w:p>
+        </w:tc>
+        <w:tc>
+          <w:tcPr>
+            <w:tcW w:type="dxa" w:w="1728"/>
+          </w:tcPr>
+          <w:p>
+            <w:pPr>
+              <w:jc w:val="center"/>
+            </w:pPr>
+            <w:r>
+              <w:rPr>
+                <w:rFonts w:ascii="Times New Roman" w:hAnsi="Times New Roman" w:eastAsia="宋体"/>
+                <w:sz w:val="16"/>
               </w:rPr>
               <w:t>167.00</w:t>
             </w:r>
@@ -194,71 +357,7 @@
             <w:r>
               <w:rPr>
                 <w:rFonts w:ascii="Times New Roman" w:hAnsi="Times New Roman" w:eastAsia="宋体"/>
-              </w:rPr>
-              <w:t>淘宝桌面版截图价格</w:t>
-            </w:r>
-          </w:p>
-        </w:tc>
-      </w:tr>
-      <w:tr>
-        <w:tc>
-          <w:tcPr>
-            <w:tcW w:type="dxa" w:w="1728"/>
-          </w:tcPr>
-          <w:p>
-            <w:r>
-              <w:rPr>
-                <w:rFonts w:ascii="Times New Roman" w:hAnsi="Times New Roman" w:eastAsia="宋体"/>
-              </w:rPr>
-              <w:t>合计</w:t>
-            </w:r>
-          </w:p>
-        </w:tc>
-        <w:tc>
-          <w:tcPr>
-            <w:tcW w:type="dxa" w:w="1728"/>
-          </w:tcPr>
-          <w:p>
-            <w:r>
-              <w:rPr>
-                <w:rFonts w:ascii="Times New Roman" w:hAnsi="Times New Roman" w:eastAsia="宋体"/>
-              </w:rPr>
-            </w:r>
-          </w:p>
-        </w:tc>
-        <w:tc>
-          <w:tcPr>
-            <w:tcW w:type="dxa" w:w="1728"/>
-          </w:tcPr>
-          <w:p>
-            <w:r>
-              <w:rPr>
-                <w:rFonts w:ascii="Times New Roman" w:hAnsi="Times New Roman" w:eastAsia="宋体"/>
-              </w:rPr>
-            </w:r>
-          </w:p>
-        </w:tc>
-        <w:tc>
-          <w:tcPr>
-            <w:tcW w:type="dxa" w:w="1728"/>
-          </w:tcPr>
-          <w:p>
-            <w:r>
-              <w:rPr>
-                <w:rFonts w:ascii="Times New Roman" w:hAnsi="Times New Roman" w:eastAsia="宋体"/>
-              </w:rPr>
-              <w:t>167.00</w:t>
-            </w:r>
-          </w:p>
-        </w:tc>
-        <w:tc>
-          <w:tcPr>
-            <w:tcW w:type="dxa" w:w="1728"/>
-          </w:tcPr>
-          <w:p>
-            <w:r>
-              <w:rPr>
-                <w:rFonts w:ascii="Times New Roman" w:hAnsi="Times New Roman" w:eastAsia="宋体"/>
+                <w:sz w:val="16"/>
               </w:rPr>
               <w:t>实际支出以下单页和发票/订单为准</w:t>
             </w:r>
@@ -272,10 +371,10 @@
       </w:pPr>
       <w:r>
         <w:rPr>
-          <w:rFonts w:ascii="Times New Roman" w:hAnsi="Times New Roman" w:eastAsia="宋体"/>
-          <w:b w:val="0"/>
+          <w:rFonts w:ascii="Times New Roman" w:hAnsi="Times New Roman" w:eastAsia="黑体"/>
+          <w:sz w:val="28"/>
         </w:rPr>
-        <w:t>三、必要性与论证</w:t>
+        <w:t>四、取得效果或结果</w:t>
       </w:r>
     </w:p>
     <w:p>
@@ -286,7 +385,7 @@
         <w:rPr>
           <w:rFonts w:ascii="Times New Roman" w:hAnsi="Times New Roman" w:eastAsia="宋体"/>
         </w:rPr>
-        <w:t>BGA200 植锡和定位是内存颗粒返修的关键工序，专用工具能显著提高重复练习的成功率。</w:t>
+        <w:t>建立实验室 BGA200 内存颗粒返修训练条件，减少后续完全依赖外部返修或整板替换的成本。</w:t>
       </w:r>
     </w:p>
     <w:p>
@@ -297,7 +396,7 @@
         <w:rPr>
           <w:rFonts w:ascii="Times New Roman" w:hAnsi="Times New Roman" w:eastAsia="宋体"/>
         </w:rPr>
-        <w:t>在内存颗粒价格溢价和开发板整板替换成本较高的背景下，掌握换颗粒流程具有明确的成本控制意义。</w:t>
+        <w:t>沉淀拆焊、清焊盘、植锡、回流和检查流程记录，支撑实验室硬件维护能力建设。</w:t>
       </w:r>
     </w:p>
     <w:p>
@@ -308,29 +407,7 @@
         <w:rPr>
           <w:rFonts w:ascii="Times New Roman" w:hAnsi="Times New Roman" w:eastAsia="宋体"/>
         </w:rPr>
-        <w:t>FPGA、Linux 开发板和边缘计算板常依赖外置 LPDDR/DDR 颗粒，返修能力可服务多个实验平台。</w:t>
-      </w:r>
-    </w:p>
-    <w:p>
-      <w:pPr>
-        <w:pStyle w:val="ListBullet"/>
-      </w:pPr>
-      <w:r>
-        <w:rPr>
-          <w:rFonts w:ascii="Times New Roman" w:hAnsi="Times New Roman" w:eastAsia="宋体"/>
-        </w:rPr>
-        <w:t>工具与耗材分开申报后，BGA200 植锡台作为长期复用工具归档，LPDDR4X 颗粒作为电子元器件耗材归档。</w:t>
-      </w:r>
-    </w:p>
-    <w:p>
-      <w:pPr>
-        <w:pStyle w:val="ListBullet"/>
-      </w:pPr>
-      <w:r>
-        <w:rPr>
-          <w:rFonts w:ascii="Times New Roman" w:hAnsi="Times New Roman" w:eastAsia="宋体"/>
-        </w:rPr>
-        <w:t>该工具属于低成本、可长期复用的实验室基础工艺工具，后续可沉淀为硬件维修 SOP。</w:t>
+        <w:t>为后续开发板和 FPGA 板卡内存颗粒替换提供实践基础。</w:t>
       </w:r>
     </w:p>
     <w:p>
@@ -339,139 +416,31 @@
       </w:pPr>
       <w:r>
         <w:rPr>
-          <w:rFonts w:ascii="Times New Roman" w:hAnsi="Times New Roman" w:eastAsia="宋体"/>
-          <w:b w:val="0"/>
+          <w:rFonts w:ascii="Times New Roman" w:hAnsi="Times New Roman" w:eastAsia="黑体"/>
+          <w:sz w:val="28"/>
         </w:rPr>
-        <w:t>四、使用计划</w:t>
+        <w:t>五、其他</w:t>
       </w:r>
     </w:p>
     <w:p>
-      <w:pPr>
-        <w:pStyle w:val="ListNumber"/>
-      </w:pPr>
-      <w:r>
-        <w:rPr>
-          <w:rFonts w:ascii="Times New Roman" w:hAnsi="Times New Roman" w:eastAsia="宋体"/>
-        </w:rPr>
-        <w:t>完成工具到货验收，记录钢网、定位板、磁铁底座和刮刀完整性。</w:t>
-      </w:r>
-    </w:p>
-    <w:p>
-      <w:pPr>
-        <w:pStyle w:val="ListNumber"/>
-      </w:pPr>
-      <w:r>
-        <w:rPr>
-          <w:rFonts w:ascii="Times New Roman" w:hAnsi="Times New Roman" w:eastAsia="宋体"/>
-        </w:rPr>
-        <w:t>使用废板或练习颗粒开展清焊盘、上锡、定位和回流流程练习。</w:t>
-      </w:r>
-    </w:p>
-    <w:p>
-      <w:pPr>
-        <w:pStyle w:val="ListNumber"/>
-      </w:pPr>
-      <w:r>
-        <w:rPr>
-          <w:rFonts w:ascii="Times New Roman" w:hAnsi="Times New Roman" w:eastAsia="宋体"/>
-        </w:rPr>
-        <w:t>记录温度曲线、焊膏量、对位误差和常见失败现象。</w:t>
-      </w:r>
-    </w:p>
-    <w:p>
-      <w:pPr>
-        <w:pStyle w:val="ListNumber"/>
-      </w:pPr>
-      <w:r>
-        <w:rPr>
-          <w:rFonts w:ascii="Times New Roman" w:hAnsi="Times New Roman" w:eastAsia="宋体"/>
-        </w:rPr>
-        <w:t>在确认流程稳定后，再评估是否用于 FPGA 或 Linux 开发板内存颗粒替换。</w:t>
-      </w:r>
-    </w:p>
-    <w:p>
-      <w:pPr>
-        <w:pStyle w:val="ListNumber"/>
-      </w:pPr>
-      <w:r>
-        <w:rPr>
-          <w:rFonts w:ascii="Times New Roman" w:hAnsi="Times New Roman" w:eastAsia="宋体"/>
-        </w:rPr>
-        <w:t>将练习照片、成功/失败样例和注意事项补充到本项目 README。</w:t>
-      </w:r>
-    </w:p>
-    <w:p>
-      <w:pPr>
-        <w:pStyle w:val="Heading1"/>
-      </w:pPr>
       <w:r>
         <w:rPr>
           <w:rFonts w:ascii="Times New Roman" w:hAnsi="Times New Roman" w:eastAsia="宋体"/>
           <w:b w:val="0"/>
         </w:rPr>
-        <w:t>五、验收标准</w:t>
+        <w:t>价格来自淘宝桌面版截图识别，实际支出以下单页和订单记录为准。采购后补充订单截图、到货照片、练习照片和失败/成功样例。</w:t>
       </w:r>
     </w:p>
     <w:p>
-      <w:pPr>
-        <w:pStyle w:val="ListBullet"/>
-      </w:pPr>
       <w:r>
         <w:rPr>
           <w:rFonts w:ascii="Times New Roman" w:hAnsi="Times New Roman" w:eastAsia="宋体"/>
+          <w:b/>
         </w:rPr>
-        <w:t>BGA200 植锡台数量、规格、外观验收完成。</w:t>
+        <w:t>图片凭证：</w:t>
       </w:r>
     </w:p>
     <w:p>
-      <w:pPr>
-        <w:pStyle w:val="ListBullet"/>
-      </w:pPr>
-      <w:r>
-        <w:rPr>
-          <w:rFonts w:ascii="Times New Roman" w:hAnsi="Times New Roman" w:eastAsia="宋体"/>
-        </w:rPr>
-        <w:t>完成至少一次 BGA200 植锡练习并形成照片记录。</w:t>
-      </w:r>
-    </w:p>
-    <w:p>
-      <w:pPr>
-        <w:pStyle w:val="ListBullet"/>
-      </w:pPr>
-      <w:r>
-        <w:rPr>
-          <w:rFonts w:ascii="Times New Roman" w:hAnsi="Times New Roman" w:eastAsia="宋体"/>
-        </w:rPr>
-        <w:t>形成一份简短返修流程记录，包括工具准备、焊盘处理、植锡、回流和检查步骤。</w:t>
-      </w:r>
-    </w:p>
-    <w:p>
-      <w:pPr>
-        <w:pStyle w:val="ListBullet"/>
-      </w:pPr>
-      <w:r>
-        <w:rPr>
-          <w:rFonts w:ascii="Times New Roman" w:hAnsi="Times New Roman" w:eastAsia="宋体"/>
-        </w:rPr>
-        <w:t>说明该流程对 FPGA、Linux 开发板等内存颗粒返修的适用边界和风险。</w:t>
-      </w:r>
-    </w:p>
-    <w:p>
-      <w:pPr>
-        <w:pStyle w:val="Heading1"/>
-      </w:pPr>
-      <w:r>
-        <w:rPr>
-          <w:rFonts w:ascii="Times New Roman" w:hAnsi="Times New Roman" w:eastAsia="宋体"/>
-          <w:b w:val="0"/>
-        </w:rPr>
-        <w:t>六、价格与图片凭证</w:t>
-      </w:r>
-    </w:p>
-    <w:p>
-      <w:pPr>
-        <w:pStyle w:val="Heading2"/>
-      </w:pPr>
       <w:r>
         <w:rPr>
           <w:rFonts w:ascii="Times New Roman" w:hAnsi="Times New Roman" w:eastAsia="宋体"/>
@@ -484,7 +453,7 @@
       <w:r>
         <w:drawing>
           <wp:inline xmlns:a="http://schemas.openxmlformats.org/drawingml/2006/main" xmlns:pic="http://schemas.openxmlformats.org/drawingml/2006/picture">
-            <wp:extent cx="5303520" cy="2883789"/>
+            <wp:extent cx="5212080" cy="2834068"/>
             <wp:docPr id="1" name="Picture 1"/>
             <wp:cNvGraphicFramePr>
               <a:graphicFrameLocks noChangeAspect="1"/>
@@ -505,7 +474,7 @@
                   <pic:spPr>
                     <a:xfrm>
                       <a:off x="0" y="0"/>
-                      <a:ext cx="5303520" cy="2883789"/>
+                      <a:ext cx="5212080" cy="2834068"/>
                     </a:xfrm>
                     <a:prstGeom prst="rect"/>
                   </pic:spPr>
@@ -514,27 +483,6 @@
             </a:graphic>
           </wp:inline>
         </w:drawing>
-      </w:r>
-    </w:p>
-    <w:p>
-      <w:pPr>
-        <w:pStyle w:val="Heading1"/>
-      </w:pPr>
-      <w:r>
-        <w:rPr>
-          <w:rFonts w:ascii="Times New Roman" w:hAnsi="Times New Roman" w:eastAsia="宋体"/>
-          <w:b w:val="0"/>
-        </w:rPr>
-        <w:t>七、其他</w:t>
-      </w:r>
-    </w:p>
-    <w:p>
-      <w:r>
-        <w:rPr>
-          <w:rFonts w:ascii="Times New Roman" w:hAnsi="Times New Roman" w:eastAsia="宋体"/>
-          <w:b w:val="0"/>
-        </w:rPr>
-        <w:t>本申报材料已将采购对象、用途、价格来源、到货验收和后续记录方式合并整理。采购后将补充订单截图、发票或付款记录、到货照片和实验使用记录，便于后续复盘申报成功情况与实际成本。</w:t>
       </w:r>
     </w:p>
     <w:sectPr>

</xml_diff>

<commit_message>
Remove workflow language from proposal docs
</commit_message>
<xml_diff>
--- a/applications/2026/Q2/BGA200内存返修工具/申报书.docx
+++ b/applications/2026/Q2/BGA200内存返修工具/申报书.docx
@@ -278,9 +278,8 @@
             <w:r>
               <w:rPr>
                 <w:rFonts w:ascii="Times New Roman" w:hAnsi="Times New Roman" w:eastAsia="宋体"/>
-                <w:sz w:val="16"/>
               </w:rPr>
-              <w:t>淘宝桌面版截图识别价格</w:t>
+              <w:t>当前记录价</w:t>
             </w:r>
           </w:p>
         </w:tc>
@@ -357,9 +356,8 @@
             <w:r>
               <w:rPr>
                 <w:rFonts w:ascii="Times New Roman" w:hAnsi="Times New Roman" w:eastAsia="宋体"/>
-                <w:sz w:val="16"/>
               </w:rPr>
-              <w:t>实际支出以下单页和发票/订单为准</w:t>
+              <w:t>实际以审批后订单及发票为准</w:t>
             </w:r>
           </w:p>
         </w:tc>
@@ -426,9 +424,8 @@
       <w:r>
         <w:rPr>
           <w:rFonts w:ascii="Times New Roman" w:hAnsi="Times New Roman" w:eastAsia="宋体"/>
-          <w:b w:val="0"/>
         </w:rPr>
-        <w:t>价格来自淘宝桌面版截图识别，实际支出以下单页和订单记录为准。采购后补充订单截图、到货照片、练习照片和失败/成功样例。</w:t>
+        <w:t>本次经费按当前记录价格测算，实际采购金额以审批后订单及发票为准。</w:t>
       </w:r>
     </w:p>
     <w:p>

</xml_diff>

<commit_message>
Refocus BGA200 proposal as repair tooling
</commit_message>
<xml_diff>
--- a/applications/2026/Q2/BGA200内存返修工具/申报书.docx
+++ b/applications/2026/Q2/BGA200内存返修工具/申报书.docx
@@ -31,9 +31,8 @@
       <w:r>
         <w:rPr>
           <w:rFonts w:ascii="Times New Roman" w:hAnsi="Times New Roman" w:eastAsia="宋体"/>
-          <w:b w:val="0"/>
         </w:rPr>
-        <w:t>开发板、FPGA 板卡和边缘计算板常使用 BGA/LPDDR 类内存颗粒，维修和升级时如果完全依赖整板替换，成本高且不利于掌握底层硬件工艺。实验室需要低成本、可长期复用的 BGA200 植锡工具，用于建立内存颗粒拆焊、植锡和回流的基本训练流程。</w:t>
+        <w:t>开发板、FPGA 板卡和边缘计算板常使用 BGA/LPDDR 类内存颗粒，维修和升级时如果完全依赖整板替换，成本高且周期不可控。实验室需要低成本、可长期复用的 BGA200 植锡工具，用于建立内存颗粒拆焊、植锡、回流和检查的返修工具条件。</w:t>
       </w:r>
     </w:p>
     <w:p>
@@ -52,9 +51,8 @@
       <w:r>
         <w:rPr>
           <w:rFonts w:ascii="Times New Roman" w:hAnsi="Times New Roman" w:eastAsia="宋体"/>
-          <w:b w:val="0"/>
         </w:rPr>
-        <w:t>采购 BGA200 4 合 1 植锡台，用于 BGA200 内存颗粒返修学习和工艺验证。工具用于钢网定位、上锡和重复练习，配套练习颗粒已归入实验室电子元器件申报，工具与耗材分开归档。</w:t>
+        <w:t>采购 BGA200 4 合 1 植锡台，用于建立 BGA200 内存颗粒返修工具条件。工具用于钢网定位、上锡和重复返修验证，配套 LPDDR4X 颗粒已归入实验室电子元器件申报，工具与耗材分开归档。</w:t>
       </w:r>
     </w:p>
     <w:p>
@@ -77,7 +75,7 @@
         <w:rPr>
           <w:rFonts w:ascii="Times New Roman" w:hAnsi="Times New Roman" w:eastAsia="宋体"/>
         </w:rPr>
-        <w:t>完成 BGA200 植锡台到货验收，确认钢网、定位板、磁铁底座和刮刀完整。</w:t>
+        <w:t>拥有一套可长期复用的 BGA200 内存颗粒返修工具，包含钢网、定位板、磁铁底座和刮刀等核心部件。</w:t>
       </w:r>
     </w:p>
     <w:p>
@@ -88,7 +86,7 @@
         <w:rPr>
           <w:rFonts w:ascii="Times New Roman" w:hAnsi="Times New Roman" w:eastAsia="宋体"/>
         </w:rPr>
-        <w:t>完成至少一次 BGA200 植锡练习，记录焊膏量、对位误差、回流效果和失败现象。</w:t>
+        <w:t>完成 Radxa Cubie A5E 相关内存升级准备，将 1G 版本升级为 4G 内存作为后续板级验证目标。</w:t>
       </w:r>
     </w:p>
     <w:p>
@@ -99,7 +97,7 @@
         <w:rPr>
           <w:rFonts w:ascii="Times New Roman" w:hAnsi="Times New Roman" w:eastAsia="宋体"/>
         </w:rPr>
-        <w:t>形成一份返修流程记录，用于后续 FPGA、Linux 开发板等内存颗粒返修学习。</w:t>
+        <w:t>形成 BGA200 内存颗粒拆焊、植锡、回流和检查流程记录，用于 FPGA、Linux 开发板、A5E 等平台的内存颗粒返修。</w:t>
       </w:r>
     </w:p>
     <w:p>
@@ -383,7 +381,7 @@
         <w:rPr>
           <w:rFonts w:ascii="Times New Roman" w:hAnsi="Times New Roman" w:eastAsia="宋体"/>
         </w:rPr>
-        <w:t>建立实验室 BGA200 内存颗粒返修训练条件，减少后续完全依赖外部返修或整板替换的成本。</w:t>
+        <w:t>让实验室拥有 BGA200 内存颗粒返修能力，减少后续完全依赖外部返修或整板替换的成本。</w:t>
       </w:r>
     </w:p>
     <w:p>
@@ -394,7 +392,7 @@
         <w:rPr>
           <w:rFonts w:ascii="Times New Roman" w:hAnsi="Times New Roman" w:eastAsia="宋体"/>
         </w:rPr>
-        <w:t>沉淀拆焊、清焊盘、植锡、回流和检查流程记录，支撑实验室硬件维护能力建设。</w:t>
+        <w:t>沉淀拆焊、清焊盘、植锡、回流和检查流程记录，支撑实验室硬件维护和板级升级能力建设。</w:t>
       </w:r>
     </w:p>
     <w:p>
@@ -405,7 +403,7 @@
         <w:rPr>
           <w:rFonts w:ascii="Times New Roman" w:hAnsi="Times New Roman" w:eastAsia="宋体"/>
         </w:rPr>
-        <w:t>为后续开发板和 FPGA 板卡内存颗粒替换提供实践基础。</w:t>
+        <w:t>为 Radxa Cubie A5E 由 1G 升级到 4G 以及后续开发板、FPGA 板卡内存颗粒替换提供工具基础。</w:t>
       </w:r>
     </w:p>
     <w:p>

</xml_diff>